<commit_message>
Update final report details
</commit_message>
<xml_diff>
--- a/report/report.docx
+++ b/report/report.docx
@@ -349,25 +349,11 @@
         </w:rPr>
         <w:t>Word Count:</w:t>
       </w:r>
-    </w:p>
-    <w:p>
-      <w:pPr>
-        <w:spacing w:after="100"/>
-        <w:rPr>
-          <w:color w:val="000000" w:themeColor="text1"/>
-        </w:rPr>
-      </w:pPr>
       <w:r>
         <w:rPr>
           <w:color w:val="000000" w:themeColor="text1"/>
         </w:rPr>
-        <w:t>Streamlit URL</w:t>
-      </w:r>
-      <w:r>
-        <w:rPr>
-          <w:color w:val="000000" w:themeColor="text1"/>
-        </w:rPr>
-        <w:t>:</w:t>
+        <w:t xml:space="preserve"> 4877 words</w:t>
       </w:r>
     </w:p>
     <w:p>
@@ -381,6 +367,32 @@
         <w:rPr>
           <w:color w:val="000000" w:themeColor="text1"/>
         </w:rPr>
+        <w:t>Streamlit URL</w:t>
+      </w:r>
+      <w:r>
+        <w:rPr>
+          <w:color w:val="000000" w:themeColor="text1"/>
+        </w:rPr>
+        <w:t>:</w:t>
+      </w:r>
+      <w:r>
+        <w:rPr>
+          <w:color w:val="000000" w:themeColor="text1"/>
+        </w:rPr>
+        <w:t xml:space="preserve"> </w:t>
+      </w:r>
+    </w:p>
+    <w:p>
+      <w:pPr>
+        <w:spacing w:after="100"/>
+        <w:rPr>
+          <w:color w:val="000000" w:themeColor="text1"/>
+        </w:rPr>
+      </w:pPr>
+      <w:r>
+        <w:rPr>
+          <w:color w:val="000000" w:themeColor="text1"/>
+        </w:rPr>
         <w:t>GitHub</w:t>
       </w:r>
       <w:r>
@@ -400,6 +412,23 @@
           <w:color w:val="000000" w:themeColor="text1"/>
         </w:rPr>
         <w:t>:</w:t>
+      </w:r>
+      <w:r>
+        <w:t xml:space="preserve"> </w:t>
+      </w:r>
+      <w:hyperlink r:id="rId6" w:history="1">
+        <w:r>
+          <w:rPr>
+            <w:rStyle w:val="Hyperlink"/>
+          </w:rPr>
+          <w:t>https://github.com/aimanhaikal-ah/z5532834_projectB</w:t>
+        </w:r>
+      </w:hyperlink>
+      <w:r>
+        <w:rPr>
+          <w:color w:val="000000" w:themeColor="text1"/>
+        </w:rPr>
+        <w:t xml:space="preserve"> </w:t>
       </w:r>
     </w:p>
     <w:p>
@@ -1639,15 +1668,11 @@
         <w:jc w:val="both"/>
         <w:rPr>
           <w:color w:val="000000" w:themeColor="text1"/>
-          <w:sz w:val="22"/>
-          <w:szCs w:val="22"/>
         </w:rPr>
       </w:pPr>
       <w:r>
         <w:rPr>
           <w:color w:val="000000" w:themeColor="text1"/>
-          <w:sz w:val="22"/>
-          <w:szCs w:val="22"/>
         </w:rPr>
         <w:t>App and Investor Journey</w:t>
       </w:r>
@@ -1659,15 +1684,13 @@
         <w:jc w:val="both"/>
         <w:rPr>
           <w:color w:val="000000" w:themeColor="text1"/>
-          <w:sz w:val="22"/>
-          <w:szCs w:val="22"/>
+          <w:szCs w:val="24"/>
         </w:rPr>
       </w:pPr>
       <w:r>
         <w:rPr>
           <w:color w:val="000000" w:themeColor="text1"/>
-          <w:sz w:val="22"/>
-          <w:szCs w:val="22"/>
+          <w:szCs w:val="24"/>
         </w:rPr>
         <w:t>Dashboard Structure</w:t>
       </w:r>
@@ -1809,14 +1832,7 @@
           <w:color w:val="000000" w:themeColor="text1"/>
           <w:sz w:val="22"/>
         </w:rPr>
-        <w:t>the</w:t>
-      </w:r>
-      <w:r>
-        <w:rPr>
-          <w:color w:val="000000" w:themeColor="text1"/>
-          <w:sz w:val="22"/>
-        </w:rPr>
-        <w:t xml:space="preserve"> Method tab explains the formulas and </w:t>
+        <w:t xml:space="preserve">the Method tab explains the formulas and </w:t>
       </w:r>
       <w:r>
         <w:rPr>
@@ -1885,15 +1901,13 @@
         <w:jc w:val="both"/>
         <w:rPr>
           <w:color w:val="000000" w:themeColor="text1"/>
-          <w:sz w:val="22"/>
-          <w:szCs w:val="22"/>
+          <w:szCs w:val="24"/>
         </w:rPr>
       </w:pPr>
       <w:r>
         <w:rPr>
           <w:color w:val="000000" w:themeColor="text1"/>
-          <w:sz w:val="22"/>
-          <w:szCs w:val="22"/>
+          <w:szCs w:val="24"/>
         </w:rPr>
         <w:t>Investor Journey</w:t>
       </w:r>
@@ -2022,15 +2036,11 @@
         <w:jc w:val="both"/>
         <w:rPr>
           <w:color w:val="000000" w:themeColor="text1"/>
-          <w:sz w:val="22"/>
-          <w:szCs w:val="22"/>
         </w:rPr>
       </w:pPr>
       <w:r>
         <w:rPr>
           <w:color w:val="000000" w:themeColor="text1"/>
-          <w:sz w:val="22"/>
-          <w:szCs w:val="22"/>
         </w:rPr>
         <w:t>Critical Reflection and Recommendations</w:t>
       </w:r>
@@ -2042,15 +2052,13 @@
         <w:jc w:val="both"/>
         <w:rPr>
           <w:color w:val="000000" w:themeColor="text1"/>
-          <w:sz w:val="22"/>
-          <w:szCs w:val="22"/>
+          <w:szCs w:val="24"/>
         </w:rPr>
       </w:pPr>
       <w:r>
         <w:rPr>
           <w:color w:val="000000" w:themeColor="text1"/>
-          <w:sz w:val="22"/>
-          <w:szCs w:val="22"/>
+          <w:szCs w:val="24"/>
         </w:rPr>
         <w:t>Reflection</w:t>
       </w:r>
@@ -2130,15 +2138,13 @@
         <w:jc w:val="both"/>
         <w:rPr>
           <w:color w:val="000000" w:themeColor="text1"/>
-          <w:sz w:val="22"/>
-          <w:szCs w:val="22"/>
+          <w:szCs w:val="24"/>
         </w:rPr>
       </w:pPr>
       <w:r>
         <w:rPr>
           <w:color w:val="000000" w:themeColor="text1"/>
-          <w:sz w:val="22"/>
-          <w:szCs w:val="22"/>
+          <w:szCs w:val="24"/>
         </w:rPr>
         <w:t>Three Concrete Recommendations</w:t>
       </w:r>
@@ -2192,15 +2198,14 @@
           <w:sz w:val="22"/>
         </w:rPr>
       </w:pPr>
-      <w:proofErr w:type="gramStart"/>
       <w:r>
         <w:rPr>
           <w:color w:val="000000" w:themeColor="text1"/>
           <w:sz w:val="22"/>
         </w:rPr>
-        <w:t>Moreover</w:t>
+        <w:lastRenderedPageBreak/>
+        <w:t>Moreover,</w:t>
       </w:r>
-      <w:proofErr w:type="gramEnd"/>
       <w:r>
         <w:rPr>
           <w:color w:val="000000" w:themeColor="text1"/>
@@ -2234,15 +2239,7 @@
           <w:color w:val="000000" w:themeColor="text1"/>
           <w:sz w:val="22"/>
         </w:rPr>
-        <w:t xml:space="preserve">to complete independent headline validation. The project now compares the finance lexicon with VADER and produces a targeted disagreement sample, but model agreement </w:t>
-      </w:r>
-      <w:r>
-        <w:rPr>
-          <w:color w:val="000000" w:themeColor="text1"/>
-          <w:sz w:val="22"/>
-        </w:rPr>
-        <w:lastRenderedPageBreak/>
-        <w:t>is not accuracy. A human-coded sample should identify false positives, false negatives, and sector-specific language before the lexicon is expanded. The revised signal should then repeat the same 2021-2022 discovery and 2023 holdout test.</w:t>
+        <w:t>to complete independent headline validation. The project now compares the finance lexicon with VADER and produces a targeted disagreement sample, but model agreement is not accuracy. A human-coded sample should identify false positives, false negatives, and sector-specific language before the lexicon is expanded. The revised signal should then repeat the same 2021-2022 discovery and 2023 holdout test.</w:t>
       </w:r>
     </w:p>
     <w:p>
@@ -2341,7 +2338,7 @@
         </w:rPr>
         <w:t xml:space="preserve">Baker, M., &amp; Wurgler, J. (2007). Investor sentiment in the stock market. The Journal of Economic Perspectives, 21(2), 129–151. </w:t>
       </w:r>
-      <w:hyperlink r:id="rId6" w:history="1">
+      <w:hyperlink r:id="rId7" w:history="1">
         <w:r>
           <w:rPr>
             <w:rStyle w:val="Hyperlink"/>
@@ -2376,7 +2373,7 @@
         </w:rPr>
         <w:t xml:space="preserve"> Strategy? Review of Financial Studies, 22(5), 1915–1953. </w:t>
       </w:r>
-      <w:hyperlink r:id="rId7" w:history="1">
+      <w:hyperlink r:id="rId8" w:history="1">
         <w:r>
           <w:rPr>
             <w:rStyle w:val="Hyperlink"/>
@@ -2397,24 +2394,12 @@
         </w:rPr>
         <w:t xml:space="preserve">Hutto, C., &amp; Gilbert, E. (2014). VADER: A Parsimonious Rule-Based Model for Sentiment Analysis of Social Media Text. Proceedings of the International AAAI Conference on Web and Social Media, 8(1), 216–225. </w:t>
       </w:r>
-      <w:hyperlink r:id="rId8" w:history="1">
+      <w:hyperlink r:id="rId9" w:history="1">
         <w:r>
           <w:rPr>
             <w:rStyle w:val="Hyperlink"/>
           </w:rPr>
-          <w:t>https://doi.org/10.1609/icwsm.v8i1.14</w:t>
-        </w:r>
-        <w:r>
-          <w:rPr>
-            <w:rStyle w:val="Hyperlink"/>
-          </w:rPr>
-          <w:t>5</w:t>
-        </w:r>
-        <w:r>
-          <w:rPr>
-            <w:rStyle w:val="Hyperlink"/>
-          </w:rPr>
-          <w:t>50</w:t>
+          <w:t>https://doi.org/10.1609/icwsm.v8i1.14550</w:t>
         </w:r>
       </w:hyperlink>
     </w:p>
@@ -2444,7 +2429,7 @@
         </w:rPr>
         <w:t xml:space="preserve">, J. (2010). The properties of equally weighted risk contribution portfolios. The Journal of Portfolio Management, 36(4), 60–70. </w:t>
       </w:r>
-      <w:hyperlink r:id="rId9" w:history="1">
+      <w:hyperlink r:id="rId10" w:history="1">
         <w:r>
           <w:rPr>
             <w:rStyle w:val="Hyperlink"/>
@@ -2463,13 +2448,7 @@
         <w:rPr>
           <w:color w:val="000000" w:themeColor="text1"/>
         </w:rPr>
-        <w:t xml:space="preserve">Markowitz, H. (1952). </w:t>
-      </w:r>
-      <w:r>
-        <w:rPr>
-          <w:color w:val="000000" w:themeColor="text1"/>
-        </w:rPr>
-        <w:t xml:space="preserve">Portfolio </w:t>
+        <w:t xml:space="preserve">Markowitz, H. (1952). Portfolio </w:t>
       </w:r>
       <w:r>
         <w:rPr>
@@ -2481,15 +2460,9 @@
         <w:rPr>
           <w:color w:val="000000" w:themeColor="text1"/>
         </w:rPr>
-        <w:t>election</w:t>
+        <w:t xml:space="preserve">election. The Journal of Finance, 7(1), 77–91. </w:t>
       </w:r>
-      <w:r>
-        <w:rPr>
-          <w:color w:val="000000" w:themeColor="text1"/>
-        </w:rPr>
-        <w:t xml:space="preserve">. The Journal of Finance, 7(1), 77–91. </w:t>
-      </w:r>
-      <w:hyperlink r:id="rId10" w:history="1">
+      <w:hyperlink r:id="rId11" w:history="1">
         <w:r>
           <w:rPr>
             <w:rStyle w:val="Hyperlink"/>
@@ -2536,7 +2509,7 @@
         </w:rPr>
         <w:t xml:space="preserve">Tetlock, P. C. (2007). Giving content to investor sentiment: The role of media in the stock market. The Journal of Finance, 62(3), 1139–1168. </w:t>
       </w:r>
-      <w:hyperlink r:id="rId11" w:history="1">
+      <w:hyperlink r:id="rId12" w:history="1">
         <w:r>
           <w:rPr>
             <w:rStyle w:val="Hyperlink"/>
@@ -16528,7 +16501,7 @@
                     <pic:cNvPicPr/>
                   </pic:nvPicPr>
                   <pic:blipFill>
-                    <a:blip r:embed="rId12"/>
+                    <a:blip r:embed="rId13"/>
                     <a:stretch>
                       <a:fillRect/>
                     </a:stretch>
@@ -16612,7 +16585,7 @@
                     <pic:cNvPicPr/>
                   </pic:nvPicPr>
                   <pic:blipFill>
-                    <a:blip r:embed="rId13"/>
+                    <a:blip r:embed="rId14"/>
                     <a:stretch>
                       <a:fillRect/>
                     </a:stretch>
@@ -16697,7 +16670,7 @@
                     <pic:cNvPicPr/>
                   </pic:nvPicPr>
                   <pic:blipFill>
-                    <a:blip r:embed="rId14"/>
+                    <a:blip r:embed="rId15"/>
                     <a:stretch>
                       <a:fillRect/>
                     </a:stretch>
@@ -16781,7 +16754,7 @@
                     <pic:cNvPicPr/>
                   </pic:nvPicPr>
                   <pic:blipFill>
-                    <a:blip r:embed="rId15"/>
+                    <a:blip r:embed="rId16"/>
                     <a:stretch>
                       <a:fillRect/>
                     </a:stretch>
@@ -16879,7 +16852,7 @@
                     <pic:cNvPicPr/>
                   </pic:nvPicPr>
                   <pic:blipFill>
-                    <a:blip r:embed="rId16"/>
+                    <a:blip r:embed="rId17"/>
                     <a:stretch>
                       <a:fillRect/>
                     </a:stretch>
@@ -16963,7 +16936,7 @@
                     <pic:cNvPicPr/>
                   </pic:nvPicPr>
                   <pic:blipFill>
-                    <a:blip r:embed="rId17"/>
+                    <a:blip r:embed="rId18"/>
                     <a:stretch>
                       <a:fillRect/>
                     </a:stretch>
@@ -17902,6 +17875,7 @@
   <w:style w:type="character" w:default="1" w:styleId="DefaultParagraphFont">
     <w:name w:val="Default Paragraph Font"/>
     <w:uiPriority w:val="1"/>
+    <w:semiHidden/>
     <w:unhideWhenUsed/>
   </w:style>
   <w:style w:type="table" w:default="1" w:styleId="TableNormal">

</xml_diff>